<commit_message>
Polish ocean theme and essay layout
</commit_message>
<xml_diff>
--- a/content/poem-essay/浅谈“春”.docx
+++ b/content/poem-essay/浅谈“春”.docx
@@ -82,7 +82,18 @@
           <w:szCs w:val="30"/>
           <w:lang w:val="en-US" w:eastAsia="zh-CN"/>
         </w:rPr>
-        <w:t>我的家乡在豫北平原，是一个可爱的小城市。每当寒冬来临，平日里就不多的热闹又要降下去一半。在历史上多次给家乡带来灾难的黄河，也在冬天隐藏了声迹。黄河在等，人们也在等，大家都在等，在等春的到来。不知道是哪个地方的冰先出现了缺口，让春意趁虚而入，使整条河都晃荡起来了，光滑的冰面碎裂成许多拍呢，却仍顽固地赖在河面上，仿佛在叫嚣着冬天还未走远。着急的野鸭已结队迈着大步进了河，在浮冰未占据的河面上游了起来，并“嘎嘎嘎”地闹着，或许是在调侃一个冬天下来泳技有些许生疏了。一望无际的平原上，绿油油的麦苗也悄悄地长起来了。纵横交错的田垄上，农民又开始了一年的劳作，这份劳动并不轻松，但这时一茬麦苗长出来的喜悦为农民带来了接下来大半年使不完的力气。人们趁着天气适宜，劳作的劳作，结婚的结婚，搬家的搬家。老人们也会趁阳光明媚，到室外聚在一起闲坐，补给冬天缺失的阳光。冬天之后就是春天，这是大自然的规律。但我有时也在想，这样的安排就是要让春天为万物补充冬天缺失的能量。</w:t>
+        <w:t>我的家乡在豫北平原，是一个可爱的小城市。每当寒冬来临，平日里就不多的热闹又要降下去一半。在历史上多次给家乡带来灾难的黄河，也在冬天隐藏了声迹。黄河在等，人们也在等，大家都在等，在等春的到来。不知道是哪个地方的冰先出现了缺口，让春意趁虚而入，使整条河都晃荡起来了，光滑的冰面碎裂成许多片</w:t>
+      </w:r>
+      <w:bookmarkStart w:id="0" w:name="_GoBack"/>
+      <w:bookmarkEnd w:id="0"/>
+      <w:r>
+        <w:rPr>
+          <w:rFonts w:hint="eastAsia"/>
+          <w:sz w:val="30"/>
+          <w:szCs w:val="30"/>
+          <w:lang w:val="en-US" w:eastAsia="zh-CN"/>
+        </w:rPr>
+        <w:t>，却仍顽固地赖在河面上，仿佛在叫嚣着冬天还未走远。着急的野鸭已结队迈着大步进了河，在浮冰未占据的河面上游了起来，并“嘎嘎嘎”地闹着，或许是在调侃一个冬天下来泳技有些许生疏了。一望无际的平原上，绿油油的麦苗也悄悄地长起来了。纵横交错的田垄上，农民又开始了一年的劳作，这份劳动并不轻松，但这时一茬麦苗长出来的喜悦为农民带来了接下来大半年使不完的力气。人们趁着天气适宜，劳作的劳作，结婚的结婚，搬家的搬家。老人们也会趁阳光明媚，到室外聚在一起闲坐，补给冬天缺失的阳光。冬天之后就是春天，这是大自然的规律。但我有时也在想，这样的安排就是要让春天为万物补充冬天缺失的能量。</w:t>
       </w:r>
     </w:p>
     <w:p>
@@ -183,8 +194,6 @@
           <w:lang w:val="en-US" w:eastAsia="zh-CN"/>
         </w:rPr>
       </w:pPr>
-      <w:bookmarkStart w:id="0" w:name="_GoBack"/>
-      <w:bookmarkEnd w:id="0"/>
       <w:r>
         <w:rPr>
           <w:rFonts w:hint="eastAsia"/>

</xml_diff>